<commit_message>
Correct career site with actual resume details
</commit_message>
<xml_diff>
--- a/resume/neha-runwal-resume.docx
+++ b/resume/neha-runwal-resume.docx
@@ -10,7 +10,7 @@
         <w:rPr>
           <w:b/>
           <w:color w:val="141F39"/>
-          <w:sz w:val="50"/>
+          <w:sz w:val="48"/>
         </w:rPr>
         <w:t>Neha Runwal</w:t>
       </w:r>
@@ -19,18 +19,18 @@
       <w:r>
         <w:rPr>
           <w:color w:val="3E567E"/>
-          <w:sz w:val="23"/>
+          <w:sz w:val="22"/>
         </w:rPr>
-        <w:t>Product-minded engineer | Enterprise builder | AI and machine learning learner</w:t>
+        <w:t>Product design, platform engineering, strategic planning, and AI-forward execution</w:t>
       </w:r>
     </w:p>
     <w:p>
       <w:r>
         <w:rPr>
           <w:color w:val="5E687C"/>
-          <w:sz w:val="19"/>
+          <w:sz w:val="18"/>
         </w:rPr>
-        <w:t>Sunnyvale, California, United States  |  LinkedIn: linkedin.com/in/neha-runwal-824b4817  |  Portfolio created with Codex</w:t>
+        <w:t>Milpitas, CA | 408-219-7990 | NehaRunwal@gmail.com | linkedin.com/in/neha-runwal-824b4817 | Portfolio created with Codex</w:t>
       </w:r>
     </w:p>
     <w:p>
@@ -38,22 +38,20 @@
         <w:rPr>
           <w:b/>
           <w:color w:val="1A3C70"/>
-          <w:sz w:val="25"/>
+          <w:sz w:val="24"/>
         </w:rPr>
-        <w:t>Professional Summary</w:t>
+        <w:t>Summary</w:t>
       </w:r>
     </w:p>
     <w:p>
-      <w:pPr/>
       <w:r>
-        <w:t>Engineer and builder with publicly visible experience across PayPal, Infosys, and Bloomintek. Combines enterprise delivery instincts, practical internal tooling experience, and product-oriented web thinking. Over the last year, has been actively learning machine learning, exploring AI tools, and experimenting with vibe coding workflows to expand the way software gets designed and shipped.</w:t>
+        <w:t>17+ years of extensive experience in product design, strategic planning, development, and execution. Ready to take on challenges and improve user experience. Recent focus includes learning machine learning, exploring AI tools, and experimenting with vibe coding workflows.</w:t>
       </w:r>
     </w:p>
     <w:tbl>
       <w:tblPr>
         <w:tblStyle w:val="TableGrid"/>
         <w:tblW w:type="auto" w:w="0"/>
-        <w:tblLayout w:type="autofit"/>
         <w:tblLook w:firstColumn="1" w:firstRow="1" w:lastColumn="0" w:lastRow="0" w:noHBand="0" w:noVBand="1" w:val="04A0"/>
       </w:tblPr>
       <w:tblGrid>
@@ -87,7 +85,7 @@
                 <w:b/>
                 <w:color w:val="141F39"/>
               </w:rPr>
-              <w:t>Selected Technologies and Domains</w:t>
+              <w:t>Technologies and Platforms</w:t>
             </w:r>
           </w:p>
         </w:tc>
@@ -103,7 +101,7 @@
               <w:pStyle w:val="ListBullet"/>
             </w:pPr>
             <w:r>
-              <w:t>Enterprise engineering and internal tools</w:t>
+              <w:t>Product design, strategic planning, architecture, development, and execution</w:t>
             </w:r>
           </w:p>
           <w:p>
@@ -111,7 +109,7 @@
               <w:pStyle w:val="ListBullet"/>
             </w:pPr>
             <w:r>
-              <w:t>Product and startup problem solving</w:t>
+              <w:t>Enterprise compliance, security, monitoring, and risk platforms</w:t>
             </w:r>
           </w:p>
           <w:p>
@@ -119,7 +117,7 @@
               <w:pStyle w:val="ListBullet"/>
             </w:pPr>
             <w:r>
-              <w:t>Fast execution under deadlines</w:t>
+              <w:t>Team leadership, product strategy, and client-facing requirement translation</w:t>
             </w:r>
           </w:p>
           <w:p>
@@ -127,7 +125,7 @@
               <w:pStyle w:val="ListBullet"/>
             </w:pPr>
             <w:r>
-              <w:t>Cross-disciplinary innovation thinking</w:t>
+              <w:t>Strong mix of startup ownership and large-scale systems delivery</w:t>
             </w:r>
           </w:p>
           <w:p>
@@ -135,7 +133,7 @@
               <w:pStyle w:val="ListBullet"/>
             </w:pPr>
             <w:r>
-              <w:t>AI-forward learning mindset</w:t>
+              <w:t>AI-forward learning mindset layered onto mature engineering judgment</w:t>
             </w:r>
           </w:p>
         </w:tc>
@@ -149,7 +147,7 @@
               <w:pStyle w:val="ListBullet"/>
             </w:pPr>
             <w:r>
-              <w:t>Perl, HTML, Shell Scripting</w:t>
+              <w:t>Python, Java, JavaScript, C, C++, Perl, HTML, DHTML, Shell Scripting</w:t>
             </w:r>
           </w:p>
           <w:p>
@@ -157,7 +155,7 @@
               <w:pStyle w:val="ListBullet"/>
             </w:pPr>
             <w:r>
-              <w:t>Web Development, Web Design, SaaS Development</w:t>
+              <w:t>Ansible, Ajax, jQuery, UNIX</w:t>
             </w:r>
           </w:p>
           <w:p>
@@ -165,7 +163,7 @@
               <w:pStyle w:val="ListBullet"/>
             </w:pPr>
             <w:r>
-              <w:t>Artificial Intelligence, Machine Learning, Deep Learning</w:t>
+              <w:t>MySQL, Oracle, Aerospike</w:t>
             </w:r>
           </w:p>
           <w:p>
@@ -173,7 +171,7 @@
               <w:pStyle w:val="ListBullet"/>
             </w:pPr>
             <w:r>
-              <w:t>Bioinformatics, Data Science, Intelligent Systems</w:t>
+              <w:t>NoSQL, Relational Databases, Dashboards, Hybrid Mobile Apps</w:t>
             </w:r>
           </w:p>
           <w:p>
@@ -181,7 +179,7 @@
               <w:pStyle w:val="ListBullet"/>
             </w:pPr>
             <w:r>
-              <w:t>AI tools, prompt workflows, vibe coding, Codex</w:t>
+              <w:t>Machine Learning, AI Tools, Vibe Coding, Codex</w:t>
             </w:r>
           </w:p>
         </w:tc>
@@ -192,9 +190,9 @@
         <w:rPr>
           <w:b/>
           <w:color w:val="1A3C70"/>
-          <w:sz w:val="25"/>
+          <w:sz w:val="24"/>
         </w:rPr>
-        <w:t>Experience and Career Highlights</w:t>
+        <w:t>Professional Experience</w:t>
       </w:r>
     </w:p>
     <w:p>
@@ -203,10 +201,10 @@
           <w:b/>
           <w:sz w:val="22"/>
         </w:rPr>
-        <w:t>Bloomintek</w:t>
+        <w:t>Stealth Mode Startup</w:t>
       </w:r>
       <w:r>
-        <w:t xml:space="preserve">  |  Product-focused software environment</w:t>
+        <w:t xml:space="preserve"> | Co-Founder | Apr 2023-Present</w:t>
       </w:r>
     </w:p>
     <w:p>
@@ -214,7 +212,7 @@
         <w:pStyle w:val="ListBullet"/>
       </w:pPr>
       <w:r>
-        <w:t>Associated with a company building software, web, branding, and SaaS experiences.</w:t>
+        <w:t>Focused on system architecture and product development.</w:t>
       </w:r>
     </w:p>
     <w:p>
@@ -222,7 +220,31 @@
         <w:pStyle w:val="ListBullet"/>
       </w:pPr>
       <w:r>
-        <w:t>Brings a builder mindset centered on user experience, digital products, and execution velocity.</w:t>
+        <w:t>Worked across all product stages including end-to-end design, architecture, and development.</w:t>
+      </w:r>
+    </w:p>
+    <w:p>
+      <w:pPr>
+        <w:pStyle w:val="ListBullet"/>
+      </w:pPr>
+      <w:r>
+        <w:t>Translated business requirements into technical solutions directly with clients.</w:t>
+      </w:r>
+    </w:p>
+    <w:p>
+      <w:pPr>
+        <w:pStyle w:val="ListBullet"/>
+      </w:pPr>
+      <w:r>
+        <w:t>Designed and developed the complete tech stack including frontend, mid-tier, and database layers.</w:t>
+      </w:r>
+    </w:p>
+    <w:p>
+      <w:pPr>
+        <w:pStyle w:val="ListBullet"/>
+      </w:pPr>
+      <w:r>
+        <w:t>Technologies: Python, HTML, JavaScript, MySQL.</w:t>
       </w:r>
     </w:p>
     <w:p>
@@ -231,10 +253,10 @@
           <w:b/>
           <w:sz w:val="22"/>
         </w:rPr>
-        <w:t>PayPal</w:t>
+        <w:t>PayPal, San Jose, USA</w:t>
       </w:r>
       <w:r>
-        <w:t xml:space="preserve">  |  Enterprise software experience</w:t>
+        <w:t xml:space="preserve"> | Member of Technical Staff | Mar 2012-Mar 2023</w:t>
       </w:r>
     </w:p>
     <w:p>
@@ -242,7 +264,7 @@
         <w:pStyle w:val="ListBullet"/>
       </w:pPr>
       <w:r>
-        <w:t>Public profile summary references more than two years of experience at PayPal.</w:t>
+        <w:t>Led multiple compliance and security-related projects in the database team.</w:t>
       </w:r>
     </w:p>
     <w:p>
@@ -250,7 +272,55 @@
         <w:pStyle w:val="ListBullet"/>
       </w:pPr>
       <w:r>
-        <w:t>Recognized with the Blue Moon Award for the Risk Sandbox project tied to Q3-Q4 2012 work.</w:t>
+        <w:t>Developed a monitoring platform for Aerospike, a NoSQL key-value database deployed on 2600+ servers, with future use across other NoSQL and relational databases.</w:t>
+      </w:r>
+    </w:p>
+    <w:p>
+      <w:pPr>
+        <w:pStyle w:val="ListBullet"/>
+      </w:pPr>
+      <w:r>
+        <w:t>Evaluated roadmap, defined product strategies, designed feature requests, led a team of 6+, and developed solutions based on client requirements.</w:t>
+      </w:r>
+    </w:p>
+    <w:p>
+      <w:pPr>
+        <w:pStyle w:val="ListBullet"/>
+      </w:pPr>
+      <w:r>
+        <w:t>Previously worked in risk and fraud detection developing applications that tracked health metrics, migrations, and sandbox transitions for 150+ risk services.</w:t>
+      </w:r>
+    </w:p>
+    <w:p>
+      <w:pPr>
+        <w:pStyle w:val="ListBullet"/>
+      </w:pPr>
+      <w:r>
+        <w:t>Led a team of six to build web applications and a hybrid mobile app for remote health status and alert checks.</w:t>
+      </w:r>
+    </w:p>
+    <w:p>
+      <w:pPr>
+        <w:pStyle w:val="ListBullet"/>
+      </w:pPr>
+      <w:r>
+        <w:t>Hosted monitoring tech expos and talks, participated in hackathons, encouraged team participation, and won BeatCTF.</w:t>
+      </w:r>
+    </w:p>
+    <w:p>
+      <w:pPr>
+        <w:pStyle w:val="ListBullet"/>
+      </w:pPr>
+      <w:r>
+        <w:t>Completed machine learning coursework and delivered introductory ML sessions internally for teams.</w:t>
+      </w:r>
+    </w:p>
+    <w:p>
+      <w:pPr>
+        <w:pStyle w:val="ListBullet"/>
+      </w:pPr>
+      <w:r>
+        <w:t>Technologies: Python, Ansible, Java, Aerospike, MySQL, Oracle.</w:t>
       </w:r>
     </w:p>
     <w:p>
@@ -259,10 +329,10 @@
           <w:b/>
           <w:sz w:val="22"/>
         </w:rPr>
-        <w:t>Infosys</w:t>
+        <w:t>PayPal, San Jose, USA</w:t>
       </w:r>
       <w:r>
-        <w:t xml:space="preserve">  |  Early engineering impact</w:t>
+        <w:t xml:space="preserve"> | Summer Intern - Software Engineer | Jun 2011-Nov 2011</w:t>
       </w:r>
     </w:p>
     <w:p>
@@ -270,7 +340,7 @@
         <w:pStyle w:val="ListBullet"/>
       </w:pPr>
       <w:r>
-        <w:t>Received the Bravo Award for creating a Weekend Support Tool in three days.</w:t>
+        <w:t>Researched and implemented new tools complementing existing monitoring systems in Risk.</w:t>
       </w:r>
     </w:p>
     <w:p>
@@ -278,7 +348,103 @@
         <w:pStyle w:val="ListBullet"/>
       </w:pPr>
       <w:r>
-        <w:t>Work explicitly referenced Perl, HTML, and shell scripting.</w:t>
+        <w:t>Created Python modules interacting with MySQL databases and tables.</w:t>
+      </w:r>
+    </w:p>
+    <w:p>
+      <w:pPr>
+        <w:pStyle w:val="ListBullet"/>
+      </w:pPr>
+      <w:r>
+        <w:t>Developed a one-pager for application health, alert dashboards, and a web application for critical risk asset visibility.</w:t>
+      </w:r>
+    </w:p>
+    <w:p>
+      <w:pPr>
+        <w:pStyle w:val="ListBullet"/>
+      </w:pPr>
+      <w:r>
+        <w:t>Showcased three dashboards during the university program and received appreciation from Risk leaders.</w:t>
+      </w:r>
+    </w:p>
+    <w:p>
+      <w:pPr>
+        <w:pStyle w:val="ListBullet"/>
+      </w:pPr>
+      <w:r>
+        <w:t>Technologies: Python, Ajax, jQuery, Java, MySQL.</w:t>
+      </w:r>
+    </w:p>
+    <w:p>
+      <w:r>
+        <w:rPr>
+          <w:b/>
+          <w:sz w:val="22"/>
+        </w:rPr>
+        <w:t>Infosys, Pune, India</w:t>
+      </w:r>
+      <w:r>
+        <w:t xml:space="preserve"> | Senior Systems Engineer | Feb 2007-Feb 2010</w:t>
+      </w:r>
+    </w:p>
+    <w:p>
+      <w:pPr>
+        <w:pStyle w:val="ListBullet"/>
+      </w:pPr>
+      <w:r>
+        <w:t>Designed and developed incoming requirements in C++ using object-oriented programming.</w:t>
+      </w:r>
+    </w:p>
+    <w:p>
+      <w:pPr>
+        <w:pStyle w:val="ListBullet"/>
+      </w:pPr>
+      <w:r>
+        <w:t>Performed black-box and white-box testing in UNIX.</w:t>
+      </w:r>
+    </w:p>
+    <w:p>
+      <w:pPr>
+        <w:pStyle w:val="ListBullet"/>
+      </w:pPr>
+      <w:r>
+        <w:t>Automated the testing environment using shell scripting and Perl.</w:t>
+      </w:r>
+    </w:p>
+    <w:p>
+      <w:pPr>
+        <w:pStyle w:val="ListBullet"/>
+      </w:pPr>
+      <w:r>
+        <w:t>Solved live issues while adhering to standard processes.</w:t>
+      </w:r>
+    </w:p>
+    <w:p>
+      <w:pPr>
+        <w:pStyle w:val="ListBullet"/>
+      </w:pPr>
+      <w:r>
+        <w:t>Technologies: C, C++, UNIX shell scripting, Perl, DHTML.</w:t>
+      </w:r>
+    </w:p>
+    <w:p>
+      <w:r>
+        <w:rPr>
+          <w:b/>
+          <w:sz w:val="22"/>
+        </w:rPr>
+        <w:t>Cummins College of Engineering, India</w:t>
+      </w:r>
+      <w:r>
+        <w:t xml:space="preserve"> | Part-time Teaching Assistant | Jul 2006-Dec 2006</w:t>
+      </w:r>
+    </w:p>
+    <w:p>
+      <w:pPr>
+        <w:pStyle w:val="ListBullet"/>
+      </w:pPr>
+      <w:r>
+        <w:t>Six months of teaching assistantship experience during the early stage of the career.</w:t>
       </w:r>
     </w:p>
     <w:p>
@@ -286,20 +452,9 @@
         <w:rPr>
           <w:b/>
           <w:color w:val="1A3C70"/>
-          <w:sz w:val="25"/>
+          <w:sz w:val="24"/>
         </w:rPr>
-        <w:t>Education and Learning</w:t>
-      </w:r>
-    </w:p>
-    <w:p>
-      <w:r>
-        <w:rPr>
-          <w:b/>
-        </w:rPr>
-        <w:t>University of Cincinnati - College of Engineering and Applied Science</w:t>
-      </w:r>
-      <w:r>
-        <w:t xml:space="preserve">  |  2021-2022</w:t>
+        <w:t>Education</w:t>
       </w:r>
     </w:p>
     <w:p>
@@ -307,7 +462,7 @@
         <w:pStyle w:val="ListBullet"/>
       </w:pPr>
       <w:r>
-        <w:t>Graduate Incentive Award: 30% tuition-waiver scholarship.</w:t>
+        <w:t>M.S. in Computer Science, San Jose State University, CA | Dec 2011 | GPA: 3.85</w:t>
       </w:r>
     </w:p>
     <w:p>
@@ -315,7 +470,17 @@
         <w:pStyle w:val="ListBullet"/>
       </w:pPr>
       <w:r>
-        <w:t>Relevant coursework included Artificial Intelligence, Machine Learning, Deep Learning, Bioinformatics, Data Science for Biomedical Research, Intelligent Systems, Intelligent Data Analysis, Innovation Design Thinking, and Interdisciplinary Innovation for Engineers.</w:t>
+        <w:t>B.E. in Computer Engineering, University of Pune, India | May 2006 | First Class with Distinction</w:t>
+      </w:r>
+    </w:p>
+    <w:p>
+      <w:r>
+        <w:rPr>
+          <w:b/>
+          <w:color w:val="1A3C70"/>
+          <w:sz w:val="24"/>
+        </w:rPr>
+        <w:t>Conference Paper and Publication</w:t>
       </w:r>
     </w:p>
     <w:p>
@@ -323,7 +488,15 @@
         <w:pStyle w:val="ListBullet"/>
       </w:pPr>
       <w:r>
-        <w:t>Over the last year: focused on machine learning, AI tools, and vibe coding exploration.</w:t>
+        <w:t>Presented at SVG Open 2011: “Drag and drop functionality for SVG using jQuery”.</w:t>
+      </w:r>
+    </w:p>
+    <w:p>
+      <w:pPr>
+        <w:pStyle w:val="ListBullet"/>
+      </w:pPr>
+      <w:r>
+        <w:t>Published online in Journal in Computer Virology on April 3, 2012: “Opcode graph similarity and metamorphic detection”.</w:t>
       </w:r>
     </w:p>
     <w:p>
@@ -331,9 +504,9 @@
         <w:rPr>
           <w:b/>
           <w:color w:val="1A3C70"/>
-          <w:sz w:val="25"/>
+          <w:sz w:val="24"/>
         </w:rPr>
-        <w:t>Awards and Recognition</w:t>
+        <w:t>Awards</w:t>
       </w:r>
     </w:p>
     <w:p>
@@ -341,7 +514,7 @@
         <w:pStyle w:val="ListBullet"/>
       </w:pPr>
       <w:r>
-        <w:t>Blue Moon Award, PayPal (June 2013) for the Risk Sandbox project.</w:t>
+        <w:t>4 Spot Awards at Infosys for critical initiatives and projects successfully led and delivered.</w:t>
       </w:r>
     </w:p>
     <w:p>
@@ -349,7 +522,7 @@
         <w:pStyle w:val="ListBullet"/>
       </w:pPr>
       <w:r>
-        <w:t>Bravo Award, Infosys (October 2009) for a Weekend Support Tool built in three days.</w:t>
+        <w:t>PayPal Blue Moon Award for successfully delivering Sandbox Risk in 2012 within a few months of joining.</w:t>
       </w:r>
     </w:p>
     <w:p>
@@ -357,26 +530,7 @@
         <w:pStyle w:val="ListBullet"/>
       </w:pPr>
       <w:r>
-        <w:t>FlyOhio Innovation Challenge 2021 - Second Place (Judges' choice) for a drone ecosystem innovation proposal.</w:t>
-      </w:r>
-    </w:p>
-    <w:p>
-      <w:pPr>
-        <w:pStyle w:val="ListBullet"/>
-      </w:pPr>
-      <w:r>
-        <w:t>Graduate Incentive Award, University of Cincinnati (August 2020).</w:t>
-      </w:r>
-    </w:p>
-    <w:p>
-      <w:r>
-        <w:rPr>
-          <w:b/>
-        </w:rPr>
-        <w:t xml:space="preserve">Note: </w:t>
-      </w:r>
-      <w:r>
-        <w:t>This resume was assembled from publicly visible professional information and the candidate's explicitly provided current AI/ML learning direction.</w:t>
+        <w:t>Infosys Bravo Award for developing a weekend support application using Perl and shell script within 3 days.</w:t>
       </w:r>
     </w:p>
     <w:sectPr>
@@ -754,7 +908,7 @@
     <w:rsid w:val="00FC693F"/>
     <w:rPr>
       <w:rFonts w:ascii="Aptos" w:hAnsi="Aptos"/>
-      <w:sz w:val="21"/>
+      <w:sz w:val="20"/>
     </w:rPr>
   </w:style>
   <w:style w:type="paragraph" w:styleId="Header">

</xml_diff>